<commit_message>
Record random client correctness diagnostic
</commit_message>
<xml_diff>
--- a/docs/paper_artifact/LE_PSI_Paper_Support_Dossier.docx
+++ b/docs/paper_artifact/LE_PSI_Paper_Support_Dossier.docx
@@ -1121,7 +1121,7 @@
         <w:rPr>
           <w:rStyle w:val="VerbatimChar"/>
         </w:rPr>
-        <w:t xml:space="preserve">scalability_tests/bench_10k.go:123-157</w:t>
+        <w:t xml:space="preserve">scalability_tests/bench_10k.go:126-160</w:t>
       </w:r>
       <w:r>
         <w:t xml:space="preserve"> </w:t>
@@ -1137,6 +1137,78 @@
           <w:rStyle w:val="VerbatimChar"/>
         </w:rPr>
         <w:t xml:space="preserve">comparative_baselines/lepsi_single_node/benchmark.sh:233-267</w:t>
+      </w:r>
+      <w:r>
+        <w:t xml:space="preserve">.</w:t>
+      </w:r>
+      <w:r>
+        <w:t xml:space="preserve"> </w:t>
+      </w:r>
+      <w:r>
+        <w:t xml:space="preserve">That follow-up was run on 2026-05-16 at commit</w:t>
+      </w:r>
+      <w:r>
+        <w:t xml:space="preserve"> </w:t>
+      </w:r>
+      <w:r>
+        <w:rPr>
+          <w:rStyle w:val="VerbatimChar"/>
+        </w:rPr>
+        <w:t xml:space="preserve">80a0527</w:t>
+      </w:r>
+      <w:r>
+        <w:t xml:space="preserve">; it found</w:t>
+      </w:r>
+      <w:r>
+        <w:t xml:space="preserve"> </w:t>
+      </w:r>
+      <w:r>
+        <w:rPr>
+          <w:rStyle w:val="VerbatimChar"/>
+        </w:rPr>
+        <w:t xml:space="preserve">matches_found=13</w:t>
+      </w:r>
+      <w:r>
+        <w:t xml:space="preserve"> </w:t>
+      </w:r>
+      <w:r>
+        <w:t xml:space="preserve">for</w:t>
+      </w:r>
+      <w:r>
+        <w:t xml:space="preserve"> </w:t>
+      </w:r>
+      <w:r>
+        <w:rPr>
+          <w:rStyle w:val="VerbatimChar"/>
+        </w:rPr>
+        <w:t xml:space="preserve">expected_intersection=10</w:t>
+      </w:r>
+      <w:r>
+        <w:t xml:space="preserve">, with</w:t>
+      </w:r>
+      <w:r>
+        <w:t xml:space="preserve"> </w:t>
+      </w:r>
+      <w:r>
+        <w:rPr>
+          <w:rStyle w:val="VerbatimChar"/>
+        </w:rPr>
+        <w:t xml:space="preserve">false_positive_count=3</w:t>
+      </w:r>
+      <w:r>
+        <w:t xml:space="preserve"> </w:t>
+      </w:r>
+      <w:r>
+        <w:t xml:space="preserve">and</w:t>
+      </w:r>
+      <w:r>
+        <w:t xml:space="preserve"> </w:t>
+      </w:r>
+      <w:r>
+        <w:rPr>
+          <w:rStyle w:val="VerbatimChar"/>
+        </w:rPr>
+        <w:t xml:space="preserve">correctness_passed=false</w:t>
       </w:r>
       <w:r>
         <w:t xml:space="preserve">.</w:t>
@@ -2639,7 +2711,7 @@
         <w:rPr>
           <w:rStyle w:val="VerbatimChar"/>
         </w:rPr>
-        <w:t xml:space="preserve">scalability_tests/bench_10k.go:123-157</w:t>
+        <w:t xml:space="preserve">scalability_tests/bench_10k.go:126-160</w:t>
       </w:r>
       <w:r>
         <w:t xml:space="preserve"> </w:t>
@@ -2654,7 +2726,7 @@
         <w:rPr>
           <w:rStyle w:val="VerbatimChar"/>
         </w:rPr>
-        <w:t xml:space="preserve">scalability_tests/bench_10k.go:164-220</w:t>
+        <w:t xml:space="preserve">scalability_tests/bench_10k.go:190-245</w:t>
       </w:r>
       <w:r>
         <w:t xml:space="preserve">; the GCE script mirrors it in</w:t>
@@ -2681,10 +2753,178 @@
         <w:rPr>
           <w:rStyle w:val="VerbatimChar"/>
         </w:rPr>
-        <w:t xml:space="preserve">comparative_baselines/lepsi_single_node/benchmark.sh:277-330</w:t>
-      </w:r>
-      <w:r>
-        <w:t xml:space="preserve">. It was added after the final 2026-05-15 evidence bundle, so random-client results should be rerun on the same VM before citing.</w:t>
+        <w:t xml:space="preserve">comparative_baselines/lepsi_single_node/benchmark.sh:300-353</w:t>
+      </w:r>
+      <w:r>
+        <w:t xml:space="preserve">.</w:t>
+      </w:r>
+    </w:p>
+    <w:p>
+      <w:pPr>
+        <w:numPr>
+          <w:ilvl w:val="0"/>
+          <w:numId w:val="1014"/>
+        </w:numPr>
+        <w:pStyle w:val="Compact"/>
+      </w:pPr>
+      <w:r>
+        <w:t xml:space="preserve">Random-client diagnostic result:</w:t>
+      </w:r>
+      <w:r>
+        <w:t xml:space="preserve"> </w:t>
+      </w:r>
+      <w:r>
+        <w:rPr>
+          <w:rStyle w:val="VerbatimChar"/>
+        </w:rPr>
+        <w:t xml:space="preserve">comparative_baselines/results/evidence/psi_repro_20260515_145900/lepsi_single_random/lepsi_single_random_20260516_rerun/lepsi_m10000_n100_random.json</w:t>
+      </w:r>
+      <w:r>
+        <w:t xml:space="preserve">.</w:t>
+      </w:r>
+    </w:p>
+    <w:p>
+      <w:pPr>
+        <w:numPr>
+          <w:ilvl w:val="0"/>
+          <w:numId w:val="1014"/>
+        </w:numPr>
+        <w:pStyle w:val="Compact"/>
+      </w:pPr>
+      <w:r>
+        <w:t xml:space="preserve">Random-client diagnostic values:</w:t>
+      </w:r>
+      <w:r>
+        <w:t xml:space="preserve"> </w:t>
+      </w:r>
+      <w:r>
+        <w:rPr>
+          <w:rStyle w:val="VerbatimChar"/>
+        </w:rPr>
+        <w:t xml:space="preserve">m=10000</w:t>
+      </w:r>
+      <w:r>
+        <w:t xml:space="preserve">,</w:t>
+      </w:r>
+      <w:r>
+        <w:t xml:space="preserve"> </w:t>
+      </w:r>
+      <w:r>
+        <w:rPr>
+          <w:rStyle w:val="VerbatimChar"/>
+        </w:rPr>
+        <w:t xml:space="preserve">n=100</w:t>
+      </w:r>
+      <w:r>
+        <w:t xml:space="preserve">,</w:t>
+      </w:r>
+      <w:r>
+        <w:t xml:space="preserve"> </w:t>
+      </w:r>
+      <w:r>
+        <w:rPr>
+          <w:rStyle w:val="VerbatimChar"/>
+        </w:rPr>
+        <w:t xml:space="preserve">total_sec=89.553163215</w:t>
+      </w:r>
+      <w:r>
+        <w:t xml:space="preserve">,</w:t>
+      </w:r>
+      <w:r>
+        <w:t xml:space="preserve"> </w:t>
+      </w:r>
+      <w:r>
+        <w:rPr>
+          <w:rStyle w:val="VerbatimChar"/>
+        </w:rPr>
+        <w:t xml:space="preserve">peak_rss_mb=21938</w:t>
+      </w:r>
+      <w:r>
+        <w:t xml:space="preserve">,</w:t>
+      </w:r>
+      <w:r>
+        <w:t xml:space="preserve"> </w:t>
+      </w:r>
+      <w:r>
+        <w:rPr>
+          <w:rStyle w:val="VerbatimChar"/>
+        </w:rPr>
+        <w:t xml:space="preserve">expected_intersection=10</w:t>
+      </w:r>
+      <w:r>
+        <w:t xml:space="preserve">,</w:t>
+      </w:r>
+      <w:r>
+        <w:t xml:space="preserve"> </w:t>
+      </w:r>
+      <w:r>
+        <w:rPr>
+          <w:rStyle w:val="VerbatimChar"/>
+        </w:rPr>
+        <w:t xml:space="preserve">matches_found=13</w:t>
+      </w:r>
+      <w:r>
+        <w:t xml:space="preserve">,</w:t>
+      </w:r>
+      <w:r>
+        <w:t xml:space="preserve"> </w:t>
+      </w:r>
+      <w:r>
+        <w:rPr>
+          <w:rStyle w:val="VerbatimChar"/>
+        </w:rPr>
+        <w:t xml:space="preserve">false_positive_count=3</w:t>
+      </w:r>
+      <w:r>
+        <w:t xml:space="preserve">,</w:t>
+      </w:r>
+      <w:r>
+        <w:t xml:space="preserve"> </w:t>
+      </w:r>
+      <w:r>
+        <w:rPr>
+          <w:rStyle w:val="VerbatimChar"/>
+        </w:rPr>
+        <w:t xml:space="preserve">false_negative_count=0</w:t>
+      </w:r>
+      <w:r>
+        <w:t xml:space="preserve">,</w:t>
+      </w:r>
+      <w:r>
+        <w:t xml:space="preserve"> </w:t>
+      </w:r>
+      <w:r>
+        <w:rPr>
+          <w:rStyle w:val="VerbatimChar"/>
+        </w:rPr>
+        <w:t xml:space="preserve">correctness_passed=false</w:t>
+      </w:r>
+      <w:r>
+        <w:t xml:space="preserve">,</w:t>
+      </w:r>
+      <w:r>
+        <w:t xml:space="preserve"> </w:t>
+      </w:r>
+      <w:r>
+        <w:rPr>
+          <w:rStyle w:val="VerbatimChar"/>
+        </w:rPr>
+        <w:t xml:space="preserve">actual_dec_calls=13</w:t>
+      </w:r>
+      <w:r>
+        <w:t xml:space="preserve">.</w:t>
+      </w:r>
+    </w:p>
+    <w:p>
+      <w:pPr>
+        <w:numPr>
+          <w:ilvl w:val="0"/>
+          <w:numId w:val="1014"/>
+        </w:numPr>
+        <w:pStyle w:val="Compact"/>
+      </w:pPr>
+      <w:r>
+        <w:t xml:space="preserve">Interpretation: this confirms that random target-leaf collisions can create false positives in the current leaf-only optimized path. Do not claim full random-workload PSI correctness for this optimized path unless an additional item-equality check or collision-handling layer is implemented and rerun.</w:t>
       </w:r>
     </w:p>
     <w:p>
@@ -3363,7 +3603,7 @@
         <w:rPr>
           <w:rStyle w:val="VerbatimChar"/>
         </w:rPr>
-        <w:t xml:space="preserve">scalability_tests/bench_10k.go:159-300</w:t>
+        <w:t xml:space="preserve">scalability_tests/bench_10k.go:185-323</w:t>
       </w:r>
       <w:r>
         <w:t xml:space="preserve">.</w:t>
@@ -3387,7 +3627,7 @@
         <w:rPr>
           <w:rStyle w:val="VerbatimChar"/>
         </w:rPr>
-        <w:t xml:space="preserve">scalability_tests/bench_10k.go:198-206</w:t>
+        <w:t xml:space="preserve">scalability_tests/bench_10k.go:224-232</w:t>
       </w:r>
       <w:r>
         <w:t xml:space="preserve">.</w:t>
@@ -3411,7 +3651,7 @@
         <w:rPr>
           <w:rStyle w:val="VerbatimChar"/>
         </w:rPr>
-        <w:t xml:space="preserve">scalability_tests/bench_10k.go:208-220</w:t>
+        <w:t xml:space="preserve">scalability_tests/bench_10k.go:234-245</w:t>
       </w:r>
       <w:r>
         <w:t xml:space="preserve">.</w:t>
@@ -3435,7 +3675,7 @@
         <w:rPr>
           <w:rStyle w:val="VerbatimChar"/>
         </w:rPr>
-        <w:t xml:space="preserve">scalability_tests/bench_10k.go:231-243</w:t>
+        <w:t xml:space="preserve">scalability_tests/bench_10k.go:257-269</w:t>
       </w:r>
       <w:r>
         <w:t xml:space="preserve">.</w:t>

</xml_diff>